<commit_message>
Segundos ajustes de repositorio
</commit_message>
<xml_diff>
--- a/fuentes/CFA2_62110066_DU.docx
+++ b/fuentes/CFA2_62110066_DU.docx
@@ -24932,8 +24932,8 @@
 </file>
 
 <file path=customXml/item4.xml><?xml version="1.0" encoding="utf-8"?>
-<ct:contentTypeSchema xmlns:ct="http://schemas.microsoft.com/office/2006/metadata/contentType" xmlns:ma="http://schemas.microsoft.com/office/2006/metadata/properties/metaAttributes" ct:_="" ma:_="" ma:contentTypeName="Documento" ma:contentTypeID="0x010100FC2B1768DD5A774EB396CCAB0DE361C1" ma:contentTypeVersion="12" ma:contentTypeDescription="Crear nuevo documento." ma:contentTypeScope="" ma:versionID="d4a546b22d2924edabf51241cf3422b8">
-  <xsd:schema xmlns:xsd="http://www.w3.org/2001/XMLSchema" xmlns:xs="http://www.w3.org/2001/XMLSchema" xmlns:p="http://schemas.microsoft.com/office/2006/metadata/properties" xmlns:ns2="a70d3c18-0869-45a1-9f75-4b4b8f0f32be" xmlns:ns3="adccf511-daff-4bcb-9072-914cedbf4c7e" targetNamespace="http://schemas.microsoft.com/office/2006/metadata/properties" ma:root="true" ma:fieldsID="e29002b2d9ca820e89c57fc59ec70c79" ns2:_="" ns3:_="">
+<ct:contentTypeSchema xmlns:ct="http://schemas.microsoft.com/office/2006/metadata/contentType" xmlns:ma="http://schemas.microsoft.com/office/2006/metadata/properties/metaAttributes" ct:_="" ma:_="" ma:contentTypeName="Documento" ma:contentTypeID="0x010100FC2B1768DD5A774EB396CCAB0DE361C1" ma:contentTypeVersion="12" ma:contentTypeDescription="Crear nuevo documento." ma:contentTypeScope="" ma:versionID="cb0e967054766e77e9abf3380aaec2f9">
+  <xsd:schema xmlns:xsd="http://www.w3.org/2001/XMLSchema" xmlns:xs="http://www.w3.org/2001/XMLSchema" xmlns:p="http://schemas.microsoft.com/office/2006/metadata/properties" xmlns:ns2="a70d3c18-0869-45a1-9f75-4b4b8f0f32be" xmlns:ns3="adccf511-daff-4bcb-9072-914cedbf4c7e" targetNamespace="http://schemas.microsoft.com/office/2006/metadata/properties" ma:root="true" ma:fieldsID="e7d77fbbcf22647d83eeb28c82daf0af" ns2:_="" ns3:_="">
     <xsd:import namespace="a70d3c18-0869-45a1-9f75-4b4b8f0f32be"/>
     <xsd:import namespace="adccf511-daff-4bcb-9072-914cedbf4c7e"/>
     <xsd:element name="properties">
@@ -25160,5 +25160,5 @@
 </file>
 
 <file path=customXml/itemProps4.xml><?xml version="1.0" encoding="utf-8"?>
-<ds:datastoreItem xmlns:ds="http://schemas.openxmlformats.org/officeDocument/2006/customXml" ds:itemID="{AB0106D4-18F5-466C-8F54-69799D6EB78B}"/>
+<ds:datastoreItem xmlns:ds="http://schemas.openxmlformats.org/officeDocument/2006/customXml" ds:itemID="{E04EDEDA-4A64-4567-8CC2-FD5340577F5E}"/>
 </file>
</xml_diff>